<commit_message>
Bao cao: khong con trang trong (24 trang), muc luc cap nhat so trang
</commit_message>
<xml_diff>
--- a/docs/report/Bao_cao_De38_Hoang_Van_Tam_DTC245200419.docx
+++ b/docs/report/Bao_cao_De38_Hoang_Van_Tam_DTC245200419.docx
@@ -1199,7 +1199,7 @@
           <w:sz w:val="26"/>
           <w:szCs w:val="26"/>
         </w:rPr>
-        <w:t xml:space="preserve">	21</w:t>
+        <w:t xml:space="preserve">	20</w:t>
       </w:r>
     </w:p>
     <w:p>
@@ -1256,7 +1256,7 @@
           <w:sz w:val="26"/>
           <w:szCs w:val="26"/>
         </w:rPr>
-        <w:t xml:space="preserve">	23</w:t>
+        <w:t xml:space="preserve">	22</w:t>
       </w:r>
     </w:p>
     <w:p>
@@ -1284,7 +1284,7 @@
           <w:sz w:val="26"/>
           <w:szCs w:val="26"/>
         </w:rPr>
-        <w:t xml:space="preserve">	24</w:t>
+        <w:t xml:space="preserve">	23</w:t>
       </w:r>
     </w:p>
     <w:p>
@@ -11380,7 +11380,7 @@
           <w:sz w:val="26"/>
           <w:szCs w:val="26"/>
         </w:rPr>
-        <w:t xml:space="preserve">Tests độc lập dùng repository giả và MemoryStore nên không đủ để khẳng định PostgreSQL hoạt động. Vì vậy báo cáo bổ sung kiểm tra trên container thật bằng smoke test, thao tác trình duyệt, pgAdmin, API của Prometheus và Loki. Khi stack vừa khởi động, một số request hết thời gian chờ 15 giây do image đang tải; sau khi các dịch vụ healthy, toàn bộ kiểm tra đều PASS.</w:t>
+        <w:t xml:space="preserve">Tests độc lập dùng repository giả nên không đủ để khẳng định PostgreSQL hoạt động; vì vậy báo cáo bổ sung kiểm tra trên container thật bằng smoke test, trình duyệt, pgAdmin, API của Prometheus và Loki. Sau khi các dịch vụ healthy, toàn bộ kiểm tra đều PASS.</w:t>
       </w:r>
     </w:p>
     <w:p>
@@ -11403,35 +11403,7 @@
           <w:sz w:val="26"/>
           <w:szCs w:val="26"/>
         </w:rPr>
-        <w:t xml:space="preserve">Script backup.sh chạy pg_dump trong container PostgreSQL và ghi file SQL vào thư mục backups nằm ngoài Git. Script restore-test.sh tạo database expense_restore_test riêng, từ chối nếu tên đó đã tồn tại, nhập dump, so sánh số dòng và checksum md5 của toàn bộ nội dung từng bảng rồi xóa database thử. Cách này không chạm vào database đang phục vụ website.</w:t>
-      </w:r>
-    </w:p>
-    <w:p>
-      <w:pPr>
-        <w:shd w:fill="F2F2F2" w:val="clear"/>
-        <w:spacing w:after="0" w:before="80" w:line="252"/>
-      </w:pPr>
-      <w:r>
-        <w:rPr>
-          <w:rFonts w:ascii="Consolas" w:cs="Consolas" w:eastAsia="Consolas" w:hAnsi="Consolas"/>
-          <w:sz w:val="18"/>
-          <w:szCs w:val="18"/>
-        </w:rPr>
-        <w:t xml:space="preserve">sh scripts/backup.sh</w:t>
-      </w:r>
-    </w:p>
-    <w:p>
-      <w:pPr>
-        <w:shd w:fill="F2F2F2" w:val="clear"/>
-        <w:spacing w:after="140" w:before="0" w:line="252"/>
-      </w:pPr>
-      <w:r>
-        <w:rPr>
-          <w:rFonts w:ascii="Consolas" w:cs="Consolas" w:eastAsia="Consolas" w:hAnsi="Consolas"/>
-          <w:sz w:val="18"/>
-          <w:szCs w:val="18"/>
-        </w:rPr>
-        <w:t xml:space="preserve">sh scripts/restore-test.sh backups/expense-20261023-141119.sql</w:t>
+        <w:t xml:space="preserve">Script backup.sh chạy pg_dump trong container PostgreSQL và ghi file SQL vào thư mục backups nằm ngoài Git. Script restore-test.sh tạo database expense_restore_test riêng, nhập dump, so sánh số dòng và checksum md5 từng bảng rồi xóa database thử, không chạm vào database đang phục vụ website.</w:t>
       </w:r>
     </w:p>
     <w:tbl>
@@ -12006,7 +11978,7 @@
           <w:sz w:val="26"/>
           <w:szCs w:val="26"/>
         </w:rPr>
-        <w:t xml:space="preserve">Bảng sessions thay đổi theo request nên không dùng làm tiêu chí dữ liệu ổn định. Sau khi build lại container app nhiều lần và bật TLS, các giao dịch vẫn còn trong PostgreSQL vì dữ liệu nằm trong named volume. Bài không dùng lệnh down -v; lệnh này xóa volume và chỉ dùng khi muốn làm lại từ đầu.</w:t>
+        <w:t xml:space="preserve">Bảng sessions thay đổi theo request nên không dùng làm tiêu chí. Sau nhiều lần build lại app và bật TLS, giao dịch vẫn còn vì dữ liệu nằm trong named volume; bài không dùng down -v vì lệnh này xóa volume.</w:t>
       </w:r>
     </w:p>
     <w:p>
@@ -12563,72 +12535,6 @@
                 <w:szCs w:val="21"/>
               </w:rPr>
               <w:t xml:space="preserve">Biểu mẫu cho chọn loại độc lập với danh mục. Sửa để loại thu/chi lấy theo danh mục và cập nhật dữ liệu lệch</w:t>
-            </w:r>
-          </w:p>
-        </w:tc>
-      </w:tr>
-      <w:tr>
-        <w:tc>
-          <w:tcPr>
-            <w:tcW w:type="dxa" w:w="3402"/>
-            <w:tcBorders>
-              <w:top w:val="single" w:color="9CA3AF" w:sz="4"/>
-              <w:left w:val="single" w:color="9CA3AF" w:sz="4"/>
-              <w:bottom w:val="single" w:color="9CA3AF" w:sz="4"/>
-              <w:right w:val="single" w:color="9CA3AF" w:sz="4"/>
-            </w:tcBorders>
-            <w:tcMar>
-              <w:top w:type="dxa" w:w="60"/>
-              <w:left w:type="dxa" w:w="100"/>
-              <w:bottom w:type="dxa" w:w="60"/>
-              <w:right w:type="dxa" w:w="100"/>
-            </w:tcMar>
-            <w:vAlign w:val="center"/>
-          </w:tcPr>
-          <w:p>
-            <w:pPr>
-              <w:spacing w:after="0" w:before="0" w:line="252"/>
-              <w:jc w:val="left"/>
-            </w:pPr>
-            <w:r>
-              <w:rPr>
-                <w:rFonts w:ascii="Times New Roman" w:cs="Times New Roman" w:eastAsia="Times New Roman" w:hAnsi="Times New Roman"/>
-                <w:sz w:val="21"/>
-                <w:szCs w:val="21"/>
-              </w:rPr>
-              <w:t xml:space="preserve">Thống kê pgAdmin hiện Live tuples 0</w:t>
-            </w:r>
-          </w:p>
-        </w:tc>
-        <w:tc>
-          <w:tcPr>
-            <w:tcW w:type="dxa" w:w="5670"/>
-            <w:tcBorders>
-              <w:top w:val="single" w:color="9CA3AF" w:sz="4"/>
-              <w:left w:val="single" w:color="9CA3AF" w:sz="4"/>
-              <w:bottom w:val="single" w:color="9CA3AF" w:sz="4"/>
-              <w:right w:val="single" w:color="9CA3AF" w:sz="4"/>
-            </w:tcBorders>
-            <w:tcMar>
-              <w:top w:type="dxa" w:w="60"/>
-              <w:left w:type="dxa" w:w="100"/>
-              <w:bottom w:type="dxa" w:w="60"/>
-              <w:right w:type="dxa" w:w="100"/>
-            </w:tcMar>
-            <w:vAlign w:val="center"/>
-          </w:tcPr>
-          <w:p>
-            <w:pPr>
-              <w:spacing w:after="0" w:before="0" w:line="252"/>
-              <w:jc w:val="left"/>
-            </w:pPr>
-            <w:r>
-              <w:rPr>
-                <w:rFonts w:ascii="Times New Roman" w:cs="Times New Roman" w:eastAsia="Times New Roman" w:hAnsi="Times New Roman"/>
-                <w:sz w:val="21"/>
-                <w:szCs w:val="21"/>
-              </w:rPr>
-              <w:t xml:space="preserve">Bộ đếm chưa cập nhật sau khi PostgreSQL khởi động lại. Chạy ANALYZE rồi làm mới</w:t>
             </w:r>
           </w:p>
         </w:tc>

</xml_diff>